<commit_message>
updating documentation (data gen)
</commit_message>
<xml_diff>
--- a/Data_generation/Documentation/data_gen_training_documentation.docx
+++ b/Data_generation/Documentation/data_gen_training_documentation.docx
@@ -1869,14 +1869,27 @@
       <w:r>
         <w:t xml:space="preserve">Table </w:t>
       </w:r>
-      <w:fldSimple w:instr=" SEQ Table \* ARABIC ">
-        <w:r>
-          <w:rPr>
-            <w:noProof/>
-          </w:rPr>
-          <w:t>1</w:t>
-        </w:r>
-      </w:fldSimple>
+      <w:r>
+        <w:fldChar w:fldCharType="begin"/>
+      </w:r>
+      <w:r>
+        <w:instrText xml:space="preserve"> SEQ Table \* ARABIC </w:instrText>
+      </w:r>
+      <w:r>
+        <w:fldChar w:fldCharType="separate"/>
+      </w:r>
+      <w:r>
+        <w:rPr>
+          <w:noProof/>
+        </w:rPr>
+        <w:t>1</w:t>
+      </w:r>
+      <w:r>
+        <w:rPr>
+          <w:noProof/>
+        </w:rPr>
+        <w:fldChar w:fldCharType="end"/>
+      </w:r>
       <w:r>
         <w:t xml:space="preserve"> IEEE123 Bus Circuit SS Configurations</w:t>
       </w:r>
@@ -2193,25 +2206,7 @@
           <w:sz w:val="24"/>
           <w:szCs w:val="24"/>
         </w:rPr>
-        <w:t xml:space="preserve">transient settings, </w:t>
-      </w:r>
-      <w:proofErr w:type="gramStart"/>
-      <w:r>
-        <w:rPr>
-          <w:rFonts w:ascii="Cambria" w:hAnsi="Cambria"/>
-          <w:sz w:val="24"/>
-          <w:szCs w:val="24"/>
-        </w:rPr>
-        <w:t>i.e.</w:t>
-      </w:r>
-      <w:proofErr w:type="gramEnd"/>
-      <w:r>
-        <w:rPr>
-          <w:rFonts w:ascii="Cambria" w:hAnsi="Cambria"/>
-          <w:sz w:val="24"/>
-          <w:szCs w:val="24"/>
-        </w:rPr>
-        <w:t xml:space="preserve"> fault types and locatio</w:t>
+        <w:t>transient settings, i.e. fault types and locatio</w:t>
       </w:r>
       <w:r>
         <w:rPr>
@@ -3631,612 +3626,66 @@
       <w:pPr>
         <w:spacing w:line="240" w:lineRule="auto"/>
         <w:rPr>
-          <w:rFonts w:ascii="Cambria" w:hAnsi="Cambria" w:cs="Courier New"/>
+          <w:rFonts w:ascii="Cambria" w:hAnsi="Cambria"/>
           <w:sz w:val="24"/>
           <w:szCs w:val="24"/>
         </w:rPr>
       </w:pPr>
       <w:r>
         <w:rPr>
-          <w:rFonts w:ascii="Cambria" w:hAnsi="Cambria" w:cs="Courier New"/>
-          <w:sz w:val="24"/>
-          <w:szCs w:val="24"/>
-        </w:rPr>
-        <w:t xml:space="preserve">The </w:t>
-      </w:r>
-      <w:r>
-        <w:rPr>
-          <w:rFonts w:ascii="Cambria" w:hAnsi="Cambria" w:cs="Courier New"/>
-          <w:sz w:val="24"/>
-          <w:szCs w:val="24"/>
-        </w:rPr>
-        <w:t xml:space="preserve">user must set directory paths to the ATP files </w:t>
-      </w:r>
-      <w:r>
-        <w:rPr>
-          <w:rFonts w:ascii="Cambria" w:hAnsi="Cambria" w:cs="Courier New"/>
-          <w:sz w:val="24"/>
-          <w:szCs w:val="24"/>
-        </w:rPr>
-        <w:t xml:space="preserve">using </w:t>
-      </w:r>
-      <w:proofErr w:type="spellStart"/>
-      <w:r>
-        <w:rPr>
-          <w:rFonts w:ascii="Courier New" w:hAnsi="Courier New" w:cs="Courier New"/>
-          <w:sz w:val="24"/>
-          <w:szCs w:val="24"/>
-        </w:rPr>
-        <w:t>atp_path</w:t>
-      </w:r>
-      <w:proofErr w:type="spellEnd"/>
-      <w:r>
-        <w:rPr>
-          <w:rFonts w:ascii="Courier New" w:hAnsi="Courier New" w:cs="Courier New"/>
-          <w:sz w:val="24"/>
-          <w:szCs w:val="24"/>
-        </w:rPr>
-        <w:t xml:space="preserve"> </w:t>
-      </w:r>
-      <w:r>
-        <w:rPr>
-          <w:rFonts w:ascii="Cambria" w:hAnsi="Cambria" w:cs="Courier New"/>
-          <w:sz w:val="24"/>
-          <w:szCs w:val="24"/>
-        </w:rPr>
-        <w:t xml:space="preserve">and an output path </w:t>
-      </w:r>
-      <w:r>
-        <w:rPr>
-          <w:rFonts w:ascii="Cambria" w:hAnsi="Cambria" w:cs="Courier New"/>
-          <w:sz w:val="24"/>
-          <w:szCs w:val="24"/>
-        </w:rPr>
-        <w:t>to store</w:t>
-      </w:r>
-      <w:r>
-        <w:rPr>
-          <w:rFonts w:ascii="Cambria" w:hAnsi="Cambria" w:cs="Courier New"/>
-          <w:sz w:val="24"/>
-          <w:szCs w:val="24"/>
-        </w:rPr>
-        <w:t xml:space="preserve"> the </w:t>
-      </w:r>
-      <w:r>
-        <w:rPr>
-          <w:rFonts w:ascii="Cambria" w:hAnsi="Cambria" w:cs="Courier New"/>
-          <w:sz w:val="24"/>
-          <w:szCs w:val="24"/>
-        </w:rPr>
-        <w:t xml:space="preserve">.pl4 files created </w:t>
-      </w:r>
-      <w:proofErr w:type="gramStart"/>
-      <w:r>
-        <w:rPr>
-          <w:rFonts w:ascii="Cambria" w:hAnsi="Cambria" w:cs="Courier New"/>
-          <w:sz w:val="24"/>
-          <w:szCs w:val="24"/>
-        </w:rPr>
-        <w:t xml:space="preserve">using </w:t>
-      </w:r>
-      <w:r>
-        <w:rPr>
-          <w:rFonts w:ascii="Cambria" w:hAnsi="Cambria" w:cs="Courier New"/>
-          <w:sz w:val="24"/>
-          <w:szCs w:val="24"/>
-        </w:rPr>
-        <w:t xml:space="preserve"> </w:t>
-      </w:r>
-      <w:r>
-        <w:rPr>
-          <w:rFonts w:ascii="Courier New" w:hAnsi="Courier New" w:cs="Courier New"/>
-          <w:sz w:val="24"/>
-          <w:szCs w:val="24"/>
-        </w:rPr>
-        <w:t>pl</w:t>
-      </w:r>
-      <w:proofErr w:type="gramEnd"/>
-      <w:r>
-        <w:rPr>
-          <w:rFonts w:ascii="Courier New" w:hAnsi="Courier New" w:cs="Courier New"/>
-          <w:sz w:val="24"/>
-          <w:szCs w:val="24"/>
-        </w:rPr>
-        <w:t>4path</w:t>
-      </w:r>
-      <w:r>
-        <w:rPr>
-          <w:rFonts w:ascii="Cambria" w:hAnsi="Cambria" w:cs="Courier New"/>
-          <w:sz w:val="24"/>
-          <w:szCs w:val="24"/>
-        </w:rPr>
-        <w:t>.</w:t>
-      </w:r>
-      <w:r>
-        <w:rPr>
-          <w:rFonts w:ascii="Cambria" w:hAnsi="Cambria" w:cs="Courier New"/>
-          <w:sz w:val="24"/>
-          <w:szCs w:val="24"/>
-        </w:rPr>
-        <w:t xml:space="preserve">  </w:t>
-      </w:r>
-      <w:r>
-        <w:rPr>
-          <w:rFonts w:ascii="Cambria" w:hAnsi="Cambria" w:cs="Courier New"/>
-          <w:sz w:val="24"/>
-          <w:szCs w:val="24"/>
-        </w:rPr>
-        <w:t xml:space="preserve">An accompanying .csv file in the models folder </w:t>
-      </w:r>
-      <w:r>
-        <w:rPr>
-          <w:rFonts w:ascii="Cambria" w:hAnsi="Cambria" w:cs="Courier New"/>
+          <w:rFonts w:ascii="Cambria" w:hAnsi="Cambria"/>
+          <w:sz w:val="24"/>
+          <w:szCs w:val="24"/>
+          <w:u w:val="single"/>
+        </w:rPr>
+        <w:t>Additional</w:t>
+      </w:r>
+      <w:r>
+        <w:rPr>
+          <w:rFonts w:ascii="Cambria" w:hAnsi="Cambria"/>
+          <w:sz w:val="24"/>
+          <w:szCs w:val="24"/>
+          <w:u w:val="single"/>
+        </w:rPr>
+        <w:t xml:space="preserve"> Settings</w:t>
+      </w:r>
+      <w:r>
+        <w:rPr>
+          <w:rFonts w:ascii="Cambria" w:hAnsi="Cambria"/>
+          <w:sz w:val="24"/>
+          <w:szCs w:val="24"/>
+        </w:rPr>
+        <w:t xml:space="preserve"> - </w:t>
+      </w:r>
+      <w:r>
+        <w:rPr>
+          <w:rFonts w:ascii="Cambria" w:hAnsi="Cambria" w:cs="Miriam Fixed"/>
           <w:i/>
           <w:iCs/>
           <w:sz w:val="24"/>
           <w:szCs w:val="24"/>
         </w:rPr>
-        <w:t>zone_info_IEEE123_PV_v2.csv</w:t>
-      </w:r>
-      <w:r>
-        <w:rPr>
-          <w:rFonts w:ascii="Cambria" w:hAnsi="Cambria" w:cs="Courier New"/>
-          <w:sz w:val="24"/>
-          <w:szCs w:val="24"/>
-        </w:rPr>
-        <w:t xml:space="preserve"> </w:t>
-      </w:r>
-      <w:r>
-        <w:rPr>
-          <w:rFonts w:ascii="Cambria" w:hAnsi="Cambria" w:cs="Courier New"/>
-          <w:sz w:val="24"/>
-          <w:szCs w:val="24"/>
-        </w:rPr>
-        <w:t>contains all zones of the network</w:t>
-      </w:r>
-      <w:r>
-        <w:rPr>
-          <w:rFonts w:ascii="Cambria" w:hAnsi="Cambria" w:cs="Courier New"/>
-          <w:sz w:val="24"/>
-          <w:szCs w:val="24"/>
-        </w:rPr>
-        <w:t>, set by</w:t>
-      </w:r>
-      <w:r>
-        <w:rPr>
-          <w:rFonts w:ascii="Cambria" w:hAnsi="Cambria" w:cs="Courier New"/>
-          <w:sz w:val="24"/>
-          <w:szCs w:val="24"/>
-        </w:rPr>
-        <w:t xml:space="preserve"> the</w:t>
-      </w:r>
-      <w:r>
-        <w:rPr>
-          <w:rFonts w:ascii="Cambria" w:hAnsi="Cambria" w:cs="Courier New"/>
-          <w:sz w:val="24"/>
-          <w:szCs w:val="24"/>
-        </w:rPr>
-        <w:t xml:space="preserve"> </w:t>
-      </w:r>
-      <w:r>
-        <w:rPr>
-          <w:rFonts w:ascii="Courier New" w:hAnsi="Courier New" w:cs="Courier New"/>
-          <w:sz w:val="24"/>
-          <w:szCs w:val="24"/>
-        </w:rPr>
-        <w:t>zones</w:t>
-      </w:r>
-      <w:r>
-        <w:rPr>
-          <w:rFonts w:ascii="Cambria" w:hAnsi="Cambria" w:cs="Courier New"/>
-          <w:sz w:val="24"/>
-          <w:szCs w:val="24"/>
-        </w:rPr>
-        <w:t xml:space="preserve"> </w:t>
-      </w:r>
-      <w:r>
-        <w:rPr>
-          <w:rFonts w:ascii="Cambria" w:hAnsi="Cambria" w:cs="Courier New"/>
-          <w:sz w:val="24"/>
-          <w:szCs w:val="24"/>
-        </w:rPr>
-        <w:t xml:space="preserve">variable </w:t>
-      </w:r>
-      <w:r>
-        <w:rPr>
-          <w:rFonts w:ascii="Cambria" w:hAnsi="Cambria" w:cs="Courier New"/>
-          <w:sz w:val="24"/>
-          <w:szCs w:val="24"/>
-        </w:rPr>
-        <w:t>read via</w:t>
-      </w:r>
-      <w:r>
-        <w:rPr>
-          <w:rFonts w:ascii="Cambria" w:hAnsi="Cambria" w:cs="Courier New"/>
-          <w:sz w:val="24"/>
-          <w:szCs w:val="24"/>
-        </w:rPr>
-        <w:t xml:space="preserve"> Pandas</w:t>
-      </w:r>
-      <w:r>
-        <w:rPr>
-          <w:rFonts w:ascii="Courier New" w:hAnsi="Courier New" w:cs="Courier New"/>
-          <w:sz w:val="24"/>
-          <w:szCs w:val="24"/>
-        </w:rPr>
-        <w:t>,</w:t>
-      </w:r>
-      <w:r>
-        <w:rPr>
-          <w:rFonts w:ascii="Cambria" w:hAnsi="Cambria" w:cs="Courier New"/>
-          <w:sz w:val="24"/>
-          <w:szCs w:val="24"/>
-        </w:rPr>
-        <w:t xml:space="preserve"> while the specific zone </w:t>
-      </w:r>
-      <w:r>
-        <w:rPr>
-          <w:rFonts w:ascii="Cambria" w:hAnsi="Cambria" w:cs="Courier New"/>
-          <w:sz w:val="24"/>
-          <w:szCs w:val="24"/>
-        </w:rPr>
-        <w:t xml:space="preserve">selected by the user in </w:t>
-      </w:r>
-      <w:r>
-        <w:rPr>
-          <w:rFonts w:ascii="Courier New" w:hAnsi="Courier New" w:cs="Courier New"/>
-          <w:sz w:val="24"/>
-          <w:szCs w:val="24"/>
-        </w:rPr>
-        <w:t>zone=</w:t>
-      </w:r>
-      <w:proofErr w:type="gramStart"/>
-      <w:r>
-        <w:rPr>
-          <w:rFonts w:ascii="Courier New" w:hAnsi="Courier New" w:cs="Courier New"/>
-          <w:sz w:val="24"/>
-          <w:szCs w:val="24"/>
-        </w:rPr>
-        <w:t>zones.zone</w:t>
-      </w:r>
-      <w:proofErr w:type="gramEnd"/>
-      <w:r>
-        <w:rPr>
-          <w:rFonts w:ascii="Courier New" w:hAnsi="Courier New" w:cs="Courier New"/>
-          <w:sz w:val="24"/>
-          <w:szCs w:val="24"/>
-        </w:rPr>
-        <w:t>_xx</w:t>
-      </w:r>
-      <w:r>
-        <w:rPr>
-          <w:rFonts w:ascii="Courier New" w:hAnsi="Courier New" w:cs="Courier New"/>
-          <w:sz w:val="24"/>
-          <w:szCs w:val="24"/>
-        </w:rPr>
-        <w:t xml:space="preserve"> </w:t>
-      </w:r>
-      <w:r>
-        <w:rPr>
-          <w:rFonts w:ascii="Cambria" w:hAnsi="Cambria" w:cs="Courier New"/>
-          <w:sz w:val="24"/>
-          <w:szCs w:val="24"/>
-        </w:rPr>
-        <w:t xml:space="preserve">from the .csv labels, </w:t>
-      </w:r>
-      <w:r>
-        <w:rPr>
-          <w:rFonts w:ascii="Cambria" w:hAnsi="Cambria" w:cs="Courier New"/>
-          <w:sz w:val="24"/>
-          <w:szCs w:val="24"/>
-        </w:rPr>
-        <w:t xml:space="preserve">runs </w:t>
-      </w:r>
-      <w:r>
-        <w:rPr>
-          <w:rFonts w:ascii="Cambria" w:hAnsi="Cambria" w:cs="Courier New"/>
-          <w:sz w:val="24"/>
-          <w:szCs w:val="24"/>
-        </w:rPr>
-        <w:t xml:space="preserve">a case study for the selected </w:t>
-      </w:r>
-      <w:r>
-        <w:rPr>
-          <w:rFonts w:ascii="Cambria" w:hAnsi="Cambria" w:cs="Courier New"/>
-          <w:sz w:val="24"/>
-          <w:szCs w:val="24"/>
-        </w:rPr>
-        <w:t>bus in that zone</w:t>
-      </w:r>
-      <w:r>
-        <w:rPr>
-          <w:rFonts w:ascii="Cambria" w:hAnsi="Cambria" w:cs="Courier New"/>
-          <w:sz w:val="24"/>
-          <w:szCs w:val="24"/>
-        </w:rPr>
-        <w:t>.</w:t>
-      </w:r>
-      <w:r>
-        <w:rPr>
-          <w:rFonts w:ascii="Cambria" w:hAnsi="Cambria" w:cs="Courier New"/>
-          <w:sz w:val="24"/>
-          <w:szCs w:val="24"/>
-        </w:rPr>
-        <w:t xml:space="preserve">  Additional </w:t>
-      </w:r>
-      <w:r>
-        <w:rPr>
-          <w:rFonts w:ascii="Cambria" w:hAnsi="Cambria" w:cs="Courier New"/>
-          <w:sz w:val="24"/>
-          <w:szCs w:val="24"/>
-        </w:rPr>
-        <w:t xml:space="preserve">python </w:t>
-      </w:r>
-      <w:r>
-        <w:rPr>
-          <w:rFonts w:ascii="Cambria" w:hAnsi="Cambria" w:cs="Courier New"/>
-          <w:sz w:val="24"/>
-          <w:szCs w:val="24"/>
-        </w:rPr>
-        <w:t xml:space="preserve">script(s) </w:t>
-      </w:r>
-      <w:r>
-        <w:rPr>
-          <w:rFonts w:ascii="Cambria" w:hAnsi="Cambria" w:cs="Courier New"/>
-          <w:sz w:val="24"/>
-          <w:szCs w:val="24"/>
-        </w:rPr>
-        <w:t>included in the model folder create the .csv files and</w:t>
-      </w:r>
-      <w:r>
-        <w:rPr>
-          <w:rFonts w:ascii="Cambria" w:hAnsi="Cambria" w:cs="Courier New"/>
-          <w:sz w:val="24"/>
-          <w:szCs w:val="24"/>
-        </w:rPr>
-        <w:t xml:space="preserve"> allow the user to </w:t>
-      </w:r>
-      <w:r>
-        <w:rPr>
-          <w:rFonts w:ascii="Cambria" w:hAnsi="Cambria" w:cs="Courier New"/>
-          <w:sz w:val="24"/>
-          <w:szCs w:val="24"/>
-        </w:rPr>
-        <w:t>manipulate</w:t>
-      </w:r>
-      <w:r>
-        <w:rPr>
-          <w:rFonts w:ascii="Cambria" w:hAnsi="Cambria" w:cs="Courier New"/>
-          <w:sz w:val="24"/>
-          <w:szCs w:val="24"/>
-        </w:rPr>
-        <w:t xml:space="preserve"> their own</w:t>
-      </w:r>
-      <w:r>
-        <w:rPr>
-          <w:rFonts w:ascii="Cambria" w:hAnsi="Cambria" w:cs="Courier New"/>
-          <w:sz w:val="24"/>
-          <w:szCs w:val="24"/>
-        </w:rPr>
-        <w:t xml:space="preserve"> zoning</w:t>
-      </w:r>
-      <w:r>
-        <w:rPr>
-          <w:rFonts w:ascii="Cambria" w:hAnsi="Cambria" w:cs="Courier New"/>
-          <w:sz w:val="24"/>
-          <w:szCs w:val="24"/>
-        </w:rPr>
-        <w:t xml:space="preserve"> labels </w:t>
-      </w:r>
-      <w:r>
-        <w:rPr>
-          <w:rFonts w:ascii="Cambria" w:hAnsi="Cambria" w:cs="Courier New"/>
-          <w:sz w:val="24"/>
-          <w:szCs w:val="24"/>
-        </w:rPr>
-        <w:t>if</w:t>
-      </w:r>
-      <w:r>
-        <w:rPr>
-          <w:rFonts w:ascii="Cambria" w:hAnsi="Cambria" w:cs="Courier New"/>
-          <w:sz w:val="24"/>
-          <w:szCs w:val="24"/>
-        </w:rPr>
-        <w:t xml:space="preserve"> preferred</w:t>
-      </w:r>
-      <w:r>
-        <w:rPr>
-          <w:rFonts w:ascii="Cambria" w:hAnsi="Cambria" w:cs="Courier New"/>
-          <w:sz w:val="24"/>
-          <w:szCs w:val="24"/>
-        </w:rPr>
-        <w:t xml:space="preserve"> </w:t>
-      </w:r>
-      <w:r>
-        <w:rPr>
-          <w:rFonts w:ascii="Cambria" w:hAnsi="Cambria" w:cs="Courier New"/>
-          <w:sz w:val="24"/>
-          <w:szCs w:val="24"/>
-        </w:rPr>
-        <w:t>via</w:t>
-      </w:r>
-      <w:r>
-        <w:rPr>
-          <w:rFonts w:ascii="Cambria" w:hAnsi="Cambria" w:cs="Courier New"/>
-          <w:sz w:val="24"/>
-          <w:szCs w:val="24"/>
-        </w:rPr>
-        <w:t xml:space="preserve"> </w:t>
-      </w:r>
-      <w:proofErr w:type="gramStart"/>
-      <w:r>
-        <w:rPr>
-          <w:rFonts w:ascii="Courier New" w:hAnsi="Courier New" w:cs="Courier New"/>
-          <w:sz w:val="24"/>
-          <w:szCs w:val="24"/>
-        </w:rPr>
-        <w:t>zone_classification_IEEE</w:t>
-      </w:r>
-      <w:r>
-        <w:rPr>
-          <w:rFonts w:ascii="Courier New" w:hAnsi="Courier New" w:cs="Courier New"/>
-          <w:sz w:val="24"/>
-          <w:szCs w:val="24"/>
-        </w:rPr>
-        <w:t>123_PVxx.py</w:t>
-      </w:r>
-      <w:r>
-        <w:rPr>
-          <w:rFonts w:ascii="Cambria" w:hAnsi="Cambria" w:cs="Courier New"/>
-          <w:sz w:val="24"/>
-          <w:szCs w:val="24"/>
-        </w:rPr>
-        <w:t>, and</w:t>
-      </w:r>
-      <w:proofErr w:type="gramEnd"/>
-      <w:r>
-        <w:rPr>
-          <w:rFonts w:ascii="Cambria" w:hAnsi="Cambria" w:cs="Courier New"/>
-          <w:sz w:val="24"/>
-          <w:szCs w:val="24"/>
-        </w:rPr>
-        <w:t xml:space="preserve"> are not needed </w:t>
-      </w:r>
-      <w:r>
-        <w:rPr>
-          <w:rFonts w:ascii="Cambria" w:hAnsi="Cambria" w:cs="Courier New"/>
-          <w:sz w:val="24"/>
-          <w:szCs w:val="24"/>
-        </w:rPr>
-        <w:t>for running transient simulations</w:t>
-      </w:r>
-      <w:r>
-        <w:rPr>
-          <w:rFonts w:ascii="Cambria" w:hAnsi="Cambria" w:cs="Courier New"/>
-          <w:sz w:val="24"/>
-          <w:szCs w:val="24"/>
-        </w:rPr>
-        <w:t xml:space="preserve">. </w:t>
-      </w:r>
-      <w:r>
-        <w:rPr>
-          <w:rFonts w:ascii="Cambria" w:hAnsi="Cambria" w:cs="Courier New"/>
-          <w:sz w:val="24"/>
-          <w:szCs w:val="24"/>
-        </w:rPr>
-        <w:t xml:space="preserve"> </w:t>
-      </w:r>
-      <w:r>
-        <w:rPr>
-          <w:rFonts w:ascii="Cambria" w:hAnsi="Cambria" w:cs="Courier New"/>
-          <w:sz w:val="24"/>
-          <w:szCs w:val="24"/>
-        </w:rPr>
-        <w:t xml:space="preserve">Having access to </w:t>
-      </w:r>
-      <w:r>
-        <w:rPr>
-          <w:rFonts w:ascii="Cambria" w:hAnsi="Cambria" w:cs="Courier New"/>
-          <w:sz w:val="24"/>
-          <w:szCs w:val="24"/>
-        </w:rPr>
-        <w:t>such a collection of</w:t>
-      </w:r>
-      <w:r>
-        <w:rPr>
-          <w:rFonts w:ascii="Cambria" w:hAnsi="Cambria" w:cs="Courier New"/>
-          <w:sz w:val="24"/>
-          <w:szCs w:val="24"/>
-        </w:rPr>
-        <w:t xml:space="preserve"> </w:t>
-      </w:r>
-      <w:r>
-        <w:rPr>
-          <w:rFonts w:ascii="Cambria" w:hAnsi="Cambria" w:cs="Courier New"/>
-          <w:sz w:val="24"/>
-          <w:szCs w:val="24"/>
-        </w:rPr>
-        <w:t>files in one package</w:t>
-      </w:r>
-      <w:r>
-        <w:rPr>
-          <w:rFonts w:ascii="Cambria" w:hAnsi="Cambria" w:cs="Courier New"/>
-          <w:sz w:val="24"/>
-          <w:szCs w:val="24"/>
-        </w:rPr>
-        <w:t xml:space="preserve"> allows the user to customize their code to</w:t>
-      </w:r>
-      <w:r>
-        <w:rPr>
-          <w:rFonts w:ascii="Cambria" w:hAnsi="Cambria" w:cs="Courier New"/>
-          <w:sz w:val="24"/>
-          <w:szCs w:val="24"/>
-        </w:rPr>
-        <w:t xml:space="preserve"> simulate</w:t>
-      </w:r>
-      <w:r>
-        <w:rPr>
-          <w:rFonts w:ascii="Cambria" w:hAnsi="Cambria" w:cs="Courier New"/>
-          <w:sz w:val="24"/>
-          <w:szCs w:val="24"/>
-        </w:rPr>
-        <w:t xml:space="preserve"> various fault types in different locations across the </w:t>
-      </w:r>
-      <w:r>
-        <w:rPr>
-          <w:rFonts w:ascii="Cambria" w:hAnsi="Cambria" w:cs="Courier New"/>
-          <w:sz w:val="24"/>
-          <w:szCs w:val="24"/>
-        </w:rPr>
-        <w:t xml:space="preserve">distribution </w:t>
-      </w:r>
-      <w:r>
-        <w:rPr>
-          <w:rFonts w:ascii="Cambria" w:hAnsi="Cambria" w:cs="Courier New"/>
-          <w:sz w:val="24"/>
-          <w:szCs w:val="24"/>
-        </w:rPr>
-        <w:t>network</w:t>
-      </w:r>
-      <w:r>
-        <w:rPr>
-          <w:rFonts w:ascii="Cambria" w:hAnsi="Cambria" w:cs="Courier New"/>
-          <w:sz w:val="24"/>
-          <w:szCs w:val="24"/>
-        </w:rPr>
-        <w:t xml:space="preserve">, while </w:t>
-      </w:r>
-      <w:r>
-        <w:rPr>
-          <w:rFonts w:ascii="Cambria" w:hAnsi="Cambria" w:cs="Courier New"/>
-          <w:sz w:val="24"/>
-          <w:szCs w:val="24"/>
-        </w:rPr>
-        <w:t>logging</w:t>
-      </w:r>
-      <w:r>
-        <w:rPr>
-          <w:rFonts w:ascii="Cambria" w:hAnsi="Cambria" w:cs="Courier New"/>
-          <w:sz w:val="24"/>
-          <w:szCs w:val="24"/>
-        </w:rPr>
-        <w:t xml:space="preserve"> transient </w:t>
-      </w:r>
-      <w:r>
-        <w:rPr>
-          <w:rFonts w:ascii="Cambria" w:hAnsi="Cambria" w:cs="Courier New"/>
-          <w:sz w:val="24"/>
-          <w:szCs w:val="24"/>
-        </w:rPr>
-        <w:t>outputs</w:t>
-      </w:r>
-      <w:r>
-        <w:rPr>
-          <w:rFonts w:ascii="Cambria" w:hAnsi="Cambria" w:cs="Courier New"/>
-          <w:sz w:val="24"/>
-          <w:szCs w:val="24"/>
-        </w:rPr>
-        <w:t xml:space="preserve">. </w:t>
+        <w:t>ATPLoopFaults_all_</w:t>
+      </w:r>
+      <w:r>
+        <w:rPr>
+          <w:rFonts w:ascii="Cambria" w:hAnsi="Cambria" w:cs="Miriam Fixed"/>
+          <w:i/>
+          <w:iCs/>
+          <w:sz w:val="24"/>
+          <w:szCs w:val="24"/>
+        </w:rPr>
+        <w:t>feeders_PV</w:t>
+      </w:r>
+      <w:r>
+        <w:rPr>
+          <w:rFonts w:ascii="Cambria" w:hAnsi="Cambria" w:cs="Miriam Fixed"/>
+          <w:i/>
+          <w:iCs/>
+          <w:sz w:val="24"/>
+          <w:szCs w:val="24"/>
+        </w:rPr>
+        <w:t>.py</w:t>
       </w:r>
     </w:p>
     <w:p>
@@ -4254,6 +3703,882 @@
           <w:sz w:val="24"/>
           <w:szCs w:val="24"/>
         </w:rPr>
+        <w:t>The ATPLoopFaults_all_feeders.py was originally intended to generate fault events on multiple different feeder models. Most of the development centered around the IEEE13 feeder, with capabilities for the IEEE123 feeder partially added. Note that many files have IEEE13 hardcoded in so use them with caution.</w:t>
+      </w:r>
+      <w:r>
+        <w:rPr>
+          <w:rFonts w:ascii="Cambria" w:hAnsi="Cambria" w:cs="Courier New"/>
+          <w:sz w:val="24"/>
+          <w:szCs w:val="24"/>
+        </w:rPr>
+        <w:t xml:space="preserve"> Updates to use an options file are recommended to make future use easier.</w:t>
+      </w:r>
+      <w:r>
+        <w:rPr>
+          <w:rFonts w:ascii="Cambria" w:hAnsi="Cambria" w:cs="Courier New"/>
+          <w:sz w:val="24"/>
+          <w:szCs w:val="24"/>
+        </w:rPr>
+        <w:t xml:space="preserve"> Here are a few updated features:</w:t>
+      </w:r>
+    </w:p>
+    <w:p>
+      <w:pPr>
+        <w:pStyle w:val="ListParagraph"/>
+        <w:numPr>
+          <w:ilvl w:val="0"/>
+          <w:numId w:val="3"/>
+        </w:numPr>
+        <w:spacing w:line="240" w:lineRule="auto"/>
+        <w:rPr>
+          <w:rFonts w:ascii="Cambria" w:hAnsi="Cambria" w:cs="Courier New"/>
+          <w:sz w:val="24"/>
+          <w:szCs w:val="24"/>
+        </w:rPr>
+      </w:pPr>
+      <w:proofErr w:type="spellStart"/>
+      <w:r>
+        <w:rPr>
+          <w:rFonts w:ascii="Courier New" w:hAnsi="Courier New" w:cs="Courier New"/>
+          <w:sz w:val="24"/>
+          <w:szCs w:val="24"/>
+        </w:rPr>
+        <w:t>run_atp_fault_</w:t>
+      </w:r>
+      <w:proofErr w:type="gramStart"/>
+      <w:r>
+        <w:rPr>
+          <w:rFonts w:ascii="Courier New" w:hAnsi="Courier New" w:cs="Courier New"/>
+          <w:sz w:val="24"/>
+          <w:szCs w:val="24"/>
+        </w:rPr>
+        <w:t>case</w:t>
+      </w:r>
+      <w:proofErr w:type="spellEnd"/>
+      <w:r>
+        <w:rPr>
+          <w:rFonts w:ascii="Courier New" w:hAnsi="Courier New" w:cs="Courier New"/>
+          <w:sz w:val="24"/>
+          <w:szCs w:val="24"/>
+        </w:rPr>
+        <w:t>(</w:t>
+      </w:r>
+      <w:proofErr w:type="gramEnd"/>
+      <w:r>
+        <w:rPr>
+          <w:rFonts w:ascii="Courier New" w:hAnsi="Courier New" w:cs="Courier New"/>
+          <w:sz w:val="24"/>
+          <w:szCs w:val="24"/>
+        </w:rPr>
+        <w:t>)</w:t>
+      </w:r>
+      <w:r>
+        <w:rPr>
+          <w:rFonts w:ascii="Courier New" w:hAnsi="Courier New" w:cs="Courier New"/>
+          <w:sz w:val="24"/>
+          <w:szCs w:val="24"/>
+        </w:rPr>
+        <w:t xml:space="preserve">- </w:t>
+      </w:r>
+      <w:r>
+        <w:rPr>
+          <w:rFonts w:ascii="Cambria" w:hAnsi="Cambria" w:cs="Courier New"/>
+          <w:sz w:val="24"/>
+          <w:szCs w:val="24"/>
+        </w:rPr>
+        <w:t>additional parameters now add randomness (these don’t require user adjustment)</w:t>
+      </w:r>
+    </w:p>
+    <w:p>
+      <w:pPr>
+        <w:pStyle w:val="ListParagraph"/>
+        <w:numPr>
+          <w:ilvl w:val="1"/>
+          <w:numId w:val="3"/>
+        </w:numPr>
+        <w:spacing w:line="240" w:lineRule="auto"/>
+        <w:rPr>
+          <w:rFonts w:ascii="Cambria" w:hAnsi="Cambria" w:cs="Courier New"/>
+          <w:sz w:val="24"/>
+          <w:szCs w:val="24"/>
+        </w:rPr>
+      </w:pPr>
+      <w:r>
+        <w:rPr>
+          <w:rFonts w:ascii="Cambria" w:hAnsi="Cambria" w:cs="Courier New"/>
+          <w:sz w:val="24"/>
+          <w:szCs w:val="24"/>
+        </w:rPr>
+        <w:t>Starting phase variation: ATP always starts at the same phase angle. To introduce phase variability to training data, time is added</w:t>
+      </w:r>
+      <w:r>
+        <w:rPr>
+          <w:rFonts w:ascii="Cambria" w:hAnsi="Cambria" w:cs="Courier New"/>
+          <w:sz w:val="24"/>
+          <w:szCs w:val="24"/>
+        </w:rPr>
+        <w:t xml:space="preserve"> through the </w:t>
+      </w:r>
+      <w:proofErr w:type="spellStart"/>
+      <w:r>
+        <w:rPr>
+          <w:rFonts w:ascii="Cambria" w:hAnsi="Cambria" w:cs="Courier New"/>
+          <w:sz w:val="24"/>
+          <w:szCs w:val="24"/>
+        </w:rPr>
+        <w:t>extra_time</w:t>
+      </w:r>
+      <w:proofErr w:type="spellEnd"/>
+      <w:r>
+        <w:rPr>
+          <w:rFonts w:ascii="Cambria" w:hAnsi="Cambria" w:cs="Courier New"/>
+          <w:sz w:val="24"/>
+          <w:szCs w:val="24"/>
+        </w:rPr>
+        <w:t xml:space="preserve"> variable and later trimmed (in gen_npz.py).</w:t>
+      </w:r>
+    </w:p>
+    <w:p>
+      <w:pPr>
+        <w:pStyle w:val="ListParagraph"/>
+        <w:numPr>
+          <w:ilvl w:val="1"/>
+          <w:numId w:val="3"/>
+        </w:numPr>
+        <w:spacing w:line="240" w:lineRule="auto"/>
+        <w:rPr>
+          <w:rFonts w:ascii="Cambria" w:hAnsi="Cambria" w:cs="Courier New"/>
+          <w:sz w:val="24"/>
+          <w:szCs w:val="24"/>
+        </w:rPr>
+      </w:pPr>
+      <w:r>
+        <w:rPr>
+          <w:rFonts w:ascii="Cambria" w:hAnsi="Cambria" w:cs="Courier New"/>
+          <w:sz w:val="24"/>
+          <w:szCs w:val="24"/>
+        </w:rPr>
+        <w:t xml:space="preserve">Loading and PV variation: </w:t>
+      </w:r>
+      <w:r>
+        <w:rPr>
+          <w:rFonts w:ascii="Cambria" w:hAnsi="Cambria" w:cs="Courier New"/>
+          <w:sz w:val="24"/>
+          <w:szCs w:val="24"/>
+        </w:rPr>
+        <w:t xml:space="preserve">the ATP network file is now randomly selected from the available 3 different loading percentages (40%, 70%, 100%) and two generation </w:t>
+      </w:r>
+      <w:proofErr w:type="spellStart"/>
+      <w:r>
+        <w:rPr>
+          <w:rFonts w:ascii="Cambria" w:hAnsi="Cambria" w:cs="Courier New"/>
+          <w:sz w:val="24"/>
+          <w:szCs w:val="24"/>
+        </w:rPr>
+        <w:t>percentations</w:t>
+      </w:r>
+      <w:proofErr w:type="spellEnd"/>
+      <w:r>
+        <w:rPr>
+          <w:rFonts w:ascii="Cambria" w:hAnsi="Cambria" w:cs="Courier New"/>
+          <w:sz w:val="24"/>
+          <w:szCs w:val="24"/>
+        </w:rPr>
+        <w:t xml:space="preserve"> (20% and 100%).</w:t>
+      </w:r>
+    </w:p>
+    <w:p>
+      <w:pPr>
+        <w:pStyle w:val="ListParagraph"/>
+        <w:numPr>
+          <w:ilvl w:val="1"/>
+          <w:numId w:val="3"/>
+        </w:numPr>
+        <w:spacing w:line="240" w:lineRule="auto"/>
+        <w:rPr>
+          <w:rFonts w:ascii="Cambria" w:hAnsi="Cambria" w:cs="Courier New"/>
+          <w:sz w:val="24"/>
+          <w:szCs w:val="24"/>
+        </w:rPr>
+      </w:pPr>
+      <w:r>
+        <w:rPr>
+          <w:rFonts w:ascii="Cambria" w:hAnsi="Cambria" w:cs="Courier New"/>
+          <w:sz w:val="24"/>
+          <w:szCs w:val="24"/>
+        </w:rPr>
+        <w:t>Note that source voltage is hardcoded (</w:t>
+      </w:r>
+      <w:proofErr w:type="spellStart"/>
+      <w:r>
+        <w:rPr>
+          <w:rFonts w:ascii="Courier New" w:hAnsi="Courier New" w:cs="Courier New"/>
+          <w:sz w:val="24"/>
+          <w:szCs w:val="24"/>
+        </w:rPr>
+        <w:t>source_vbase</w:t>
+      </w:r>
+      <w:proofErr w:type="spellEnd"/>
+      <w:r>
+        <w:rPr>
+          <w:rFonts w:ascii="Cambria" w:hAnsi="Cambria" w:cs="Courier New"/>
+          <w:sz w:val="24"/>
+          <w:szCs w:val="24"/>
+        </w:rPr>
+        <w:t xml:space="preserve"> variable) so this must be changed depending on the feeder voltage.</w:t>
+      </w:r>
+    </w:p>
+    <w:p>
+      <w:pPr>
+        <w:pStyle w:val="ListParagraph"/>
+        <w:numPr>
+          <w:ilvl w:val="0"/>
+          <w:numId w:val="3"/>
+        </w:numPr>
+        <w:spacing w:line="240" w:lineRule="auto"/>
+        <w:rPr>
+          <w:rFonts w:ascii="Cambria" w:hAnsi="Cambria" w:cs="Courier New"/>
+          <w:sz w:val="24"/>
+          <w:szCs w:val="24"/>
+        </w:rPr>
+      </w:pPr>
+      <w:r>
+        <w:rPr>
+          <w:rFonts w:ascii="Cambria" w:hAnsi="Cambria" w:cs="Courier New"/>
+          <w:sz w:val="24"/>
+          <w:szCs w:val="24"/>
+        </w:rPr>
+        <w:lastRenderedPageBreak/>
+        <w:t>Conversions added. The end of the script now has the option to automatically call the various conversion scripts (detailed in the companion file pl4_data_conversion_documentation.doc).</w:t>
+      </w:r>
+    </w:p>
+    <w:p>
+      <w:pPr>
+        <w:spacing w:line="240" w:lineRule="auto"/>
+        <w:rPr>
+          <w:rFonts w:ascii="Cambria" w:hAnsi="Cambria" w:cs="Courier New"/>
+          <w:sz w:val="24"/>
+          <w:szCs w:val="24"/>
+        </w:rPr>
+      </w:pPr>
+      <w:r>
+        <w:rPr>
+          <w:rFonts w:ascii="Cambria" w:hAnsi="Cambria" w:cs="Courier New"/>
+          <w:sz w:val="24"/>
+          <w:szCs w:val="24"/>
+        </w:rPr>
+        <w:t xml:space="preserve">The </w:t>
+      </w:r>
+      <w:r>
+        <w:rPr>
+          <w:rFonts w:ascii="Cambria" w:hAnsi="Cambria" w:cs="Courier New"/>
+          <w:sz w:val="24"/>
+          <w:szCs w:val="24"/>
+        </w:rPr>
+        <w:t xml:space="preserve">user must set directory paths to the ATP files </w:t>
+      </w:r>
+      <w:r>
+        <w:rPr>
+          <w:rFonts w:ascii="Cambria" w:hAnsi="Cambria" w:cs="Courier New"/>
+          <w:sz w:val="24"/>
+          <w:szCs w:val="24"/>
+        </w:rPr>
+        <w:t xml:space="preserve">using </w:t>
+      </w:r>
+      <w:proofErr w:type="spellStart"/>
+      <w:r>
+        <w:rPr>
+          <w:rFonts w:ascii="Courier New" w:hAnsi="Courier New" w:cs="Courier New"/>
+          <w:sz w:val="24"/>
+          <w:szCs w:val="24"/>
+        </w:rPr>
+        <w:t>atp_path</w:t>
+      </w:r>
+      <w:proofErr w:type="spellEnd"/>
+      <w:r>
+        <w:rPr>
+          <w:rFonts w:ascii="Courier New" w:hAnsi="Courier New" w:cs="Courier New"/>
+          <w:sz w:val="24"/>
+          <w:szCs w:val="24"/>
+        </w:rPr>
+        <w:t xml:space="preserve"> </w:t>
+      </w:r>
+      <w:r>
+        <w:rPr>
+          <w:rFonts w:ascii="Cambria" w:hAnsi="Cambria" w:cs="Courier New"/>
+          <w:sz w:val="24"/>
+          <w:szCs w:val="24"/>
+        </w:rPr>
+        <w:t xml:space="preserve">and an output path </w:t>
+      </w:r>
+      <w:r>
+        <w:rPr>
+          <w:rFonts w:ascii="Cambria" w:hAnsi="Cambria" w:cs="Courier New"/>
+          <w:sz w:val="24"/>
+          <w:szCs w:val="24"/>
+        </w:rPr>
+        <w:t>to store</w:t>
+      </w:r>
+      <w:r>
+        <w:rPr>
+          <w:rFonts w:ascii="Cambria" w:hAnsi="Cambria" w:cs="Courier New"/>
+          <w:sz w:val="24"/>
+          <w:szCs w:val="24"/>
+        </w:rPr>
+        <w:t xml:space="preserve"> the </w:t>
+      </w:r>
+      <w:r>
+        <w:rPr>
+          <w:rFonts w:ascii="Cambria" w:hAnsi="Cambria" w:cs="Courier New"/>
+          <w:sz w:val="24"/>
+          <w:szCs w:val="24"/>
+        </w:rPr>
+        <w:t xml:space="preserve">.pl4 files created </w:t>
+      </w:r>
+      <w:proofErr w:type="gramStart"/>
+      <w:r>
+        <w:rPr>
+          <w:rFonts w:ascii="Cambria" w:hAnsi="Cambria" w:cs="Courier New"/>
+          <w:sz w:val="24"/>
+          <w:szCs w:val="24"/>
+        </w:rPr>
+        <w:t xml:space="preserve">using </w:t>
+      </w:r>
+      <w:r>
+        <w:rPr>
+          <w:rFonts w:ascii="Cambria" w:hAnsi="Cambria" w:cs="Courier New"/>
+          <w:sz w:val="24"/>
+          <w:szCs w:val="24"/>
+        </w:rPr>
+        <w:t xml:space="preserve"> </w:t>
+      </w:r>
+      <w:r>
+        <w:rPr>
+          <w:rFonts w:ascii="Courier New" w:hAnsi="Courier New" w:cs="Courier New"/>
+          <w:sz w:val="24"/>
+          <w:szCs w:val="24"/>
+        </w:rPr>
+        <w:t>pl</w:t>
+      </w:r>
+      <w:proofErr w:type="gramEnd"/>
+      <w:r>
+        <w:rPr>
+          <w:rFonts w:ascii="Courier New" w:hAnsi="Courier New" w:cs="Courier New"/>
+          <w:sz w:val="24"/>
+          <w:szCs w:val="24"/>
+        </w:rPr>
+        <w:t>4path</w:t>
+      </w:r>
+      <w:r>
+        <w:rPr>
+          <w:rFonts w:ascii="Cambria" w:hAnsi="Cambria" w:cs="Courier New"/>
+          <w:sz w:val="24"/>
+          <w:szCs w:val="24"/>
+        </w:rPr>
+        <w:t>.</w:t>
+      </w:r>
+      <w:r>
+        <w:rPr>
+          <w:rFonts w:ascii="Cambria" w:hAnsi="Cambria" w:cs="Courier New"/>
+          <w:sz w:val="24"/>
+          <w:szCs w:val="24"/>
+        </w:rPr>
+        <w:t xml:space="preserve">  </w:t>
+      </w:r>
+      <w:r>
+        <w:rPr>
+          <w:rFonts w:ascii="Cambria" w:hAnsi="Cambria" w:cs="Courier New"/>
+          <w:sz w:val="24"/>
+          <w:szCs w:val="24"/>
+        </w:rPr>
+        <w:t xml:space="preserve">An accompanying .csv file in the models folder </w:t>
+      </w:r>
+      <w:r>
+        <w:rPr>
+          <w:rFonts w:ascii="Cambria" w:hAnsi="Cambria" w:cs="Courier New"/>
+          <w:i/>
+          <w:iCs/>
+          <w:sz w:val="24"/>
+          <w:szCs w:val="24"/>
+        </w:rPr>
+        <w:t>zone_info_IEEE123_PV_v2.csv</w:t>
+      </w:r>
+      <w:r>
+        <w:rPr>
+          <w:rFonts w:ascii="Cambria" w:hAnsi="Cambria" w:cs="Courier New"/>
+          <w:sz w:val="24"/>
+          <w:szCs w:val="24"/>
+        </w:rPr>
+        <w:t xml:space="preserve"> </w:t>
+      </w:r>
+      <w:r>
+        <w:rPr>
+          <w:rFonts w:ascii="Cambria" w:hAnsi="Cambria" w:cs="Courier New"/>
+          <w:sz w:val="24"/>
+          <w:szCs w:val="24"/>
+        </w:rPr>
+        <w:t>contains all zones of the network</w:t>
+      </w:r>
+      <w:r>
+        <w:rPr>
+          <w:rFonts w:ascii="Cambria" w:hAnsi="Cambria" w:cs="Courier New"/>
+          <w:sz w:val="24"/>
+          <w:szCs w:val="24"/>
+        </w:rPr>
+        <w:t>, set by</w:t>
+      </w:r>
+      <w:r>
+        <w:rPr>
+          <w:rFonts w:ascii="Cambria" w:hAnsi="Cambria" w:cs="Courier New"/>
+          <w:sz w:val="24"/>
+          <w:szCs w:val="24"/>
+        </w:rPr>
+        <w:t xml:space="preserve"> the</w:t>
+      </w:r>
+      <w:r>
+        <w:rPr>
+          <w:rFonts w:ascii="Cambria" w:hAnsi="Cambria" w:cs="Courier New"/>
+          <w:sz w:val="24"/>
+          <w:szCs w:val="24"/>
+        </w:rPr>
+        <w:t xml:space="preserve"> </w:t>
+      </w:r>
+      <w:r>
+        <w:rPr>
+          <w:rFonts w:ascii="Courier New" w:hAnsi="Courier New" w:cs="Courier New"/>
+          <w:sz w:val="24"/>
+          <w:szCs w:val="24"/>
+        </w:rPr>
+        <w:t>zones</w:t>
+      </w:r>
+      <w:r>
+        <w:rPr>
+          <w:rFonts w:ascii="Cambria" w:hAnsi="Cambria" w:cs="Courier New"/>
+          <w:sz w:val="24"/>
+          <w:szCs w:val="24"/>
+        </w:rPr>
+        <w:t xml:space="preserve"> </w:t>
+      </w:r>
+      <w:r>
+        <w:rPr>
+          <w:rFonts w:ascii="Cambria" w:hAnsi="Cambria" w:cs="Courier New"/>
+          <w:sz w:val="24"/>
+          <w:szCs w:val="24"/>
+        </w:rPr>
+        <w:t xml:space="preserve">variable </w:t>
+      </w:r>
+      <w:r>
+        <w:rPr>
+          <w:rFonts w:ascii="Cambria" w:hAnsi="Cambria" w:cs="Courier New"/>
+          <w:sz w:val="24"/>
+          <w:szCs w:val="24"/>
+        </w:rPr>
+        <w:t>read via</w:t>
+      </w:r>
+      <w:r>
+        <w:rPr>
+          <w:rFonts w:ascii="Cambria" w:hAnsi="Cambria" w:cs="Courier New"/>
+          <w:sz w:val="24"/>
+          <w:szCs w:val="24"/>
+        </w:rPr>
+        <w:t xml:space="preserve"> Pandas</w:t>
+      </w:r>
+      <w:r>
+        <w:rPr>
+          <w:rFonts w:ascii="Courier New" w:hAnsi="Courier New" w:cs="Courier New"/>
+          <w:sz w:val="24"/>
+          <w:szCs w:val="24"/>
+        </w:rPr>
+        <w:t>,</w:t>
+      </w:r>
+      <w:r>
+        <w:rPr>
+          <w:rFonts w:ascii="Cambria" w:hAnsi="Cambria" w:cs="Courier New"/>
+          <w:sz w:val="24"/>
+          <w:szCs w:val="24"/>
+        </w:rPr>
+        <w:t xml:space="preserve"> while the specific zone </w:t>
+      </w:r>
+      <w:r>
+        <w:rPr>
+          <w:rFonts w:ascii="Cambria" w:hAnsi="Cambria" w:cs="Courier New"/>
+          <w:sz w:val="24"/>
+          <w:szCs w:val="24"/>
+        </w:rPr>
+        <w:t xml:space="preserve">selected by the user in </w:t>
+      </w:r>
+      <w:r>
+        <w:rPr>
+          <w:rFonts w:ascii="Courier New" w:hAnsi="Courier New" w:cs="Courier New"/>
+          <w:sz w:val="24"/>
+          <w:szCs w:val="24"/>
+        </w:rPr>
+        <w:t>zone=</w:t>
+      </w:r>
+      <w:proofErr w:type="gramStart"/>
+      <w:r>
+        <w:rPr>
+          <w:rFonts w:ascii="Courier New" w:hAnsi="Courier New" w:cs="Courier New"/>
+          <w:sz w:val="24"/>
+          <w:szCs w:val="24"/>
+        </w:rPr>
+        <w:t>zones.zone</w:t>
+      </w:r>
+      <w:proofErr w:type="gramEnd"/>
+      <w:r>
+        <w:rPr>
+          <w:rFonts w:ascii="Courier New" w:hAnsi="Courier New" w:cs="Courier New"/>
+          <w:sz w:val="24"/>
+          <w:szCs w:val="24"/>
+        </w:rPr>
+        <w:t>_xx</w:t>
+      </w:r>
+      <w:r>
+        <w:rPr>
+          <w:rFonts w:ascii="Courier New" w:hAnsi="Courier New" w:cs="Courier New"/>
+          <w:sz w:val="24"/>
+          <w:szCs w:val="24"/>
+        </w:rPr>
+        <w:t xml:space="preserve"> </w:t>
+      </w:r>
+      <w:r>
+        <w:rPr>
+          <w:rFonts w:ascii="Cambria" w:hAnsi="Cambria" w:cs="Courier New"/>
+          <w:sz w:val="24"/>
+          <w:szCs w:val="24"/>
+        </w:rPr>
+        <w:t xml:space="preserve">from the .csv labels, </w:t>
+      </w:r>
+      <w:r>
+        <w:rPr>
+          <w:rFonts w:ascii="Cambria" w:hAnsi="Cambria" w:cs="Courier New"/>
+          <w:sz w:val="24"/>
+          <w:szCs w:val="24"/>
+        </w:rPr>
+        <w:t xml:space="preserve">runs </w:t>
+      </w:r>
+      <w:r>
+        <w:rPr>
+          <w:rFonts w:ascii="Cambria" w:hAnsi="Cambria" w:cs="Courier New"/>
+          <w:sz w:val="24"/>
+          <w:szCs w:val="24"/>
+        </w:rPr>
+        <w:t xml:space="preserve">a case study for the selected </w:t>
+      </w:r>
+      <w:r>
+        <w:rPr>
+          <w:rFonts w:ascii="Cambria" w:hAnsi="Cambria" w:cs="Courier New"/>
+          <w:sz w:val="24"/>
+          <w:szCs w:val="24"/>
+        </w:rPr>
+        <w:t>bus in that zone</w:t>
+      </w:r>
+      <w:r>
+        <w:rPr>
+          <w:rFonts w:ascii="Cambria" w:hAnsi="Cambria" w:cs="Courier New"/>
+          <w:sz w:val="24"/>
+          <w:szCs w:val="24"/>
+        </w:rPr>
+        <w:t>.</w:t>
+      </w:r>
+      <w:r>
+        <w:rPr>
+          <w:rFonts w:ascii="Cambria" w:hAnsi="Cambria" w:cs="Courier New"/>
+          <w:sz w:val="24"/>
+          <w:szCs w:val="24"/>
+        </w:rPr>
+        <w:t xml:space="preserve">  Additional </w:t>
+      </w:r>
+      <w:r>
+        <w:rPr>
+          <w:rFonts w:ascii="Cambria" w:hAnsi="Cambria" w:cs="Courier New"/>
+          <w:sz w:val="24"/>
+          <w:szCs w:val="24"/>
+        </w:rPr>
+        <w:t xml:space="preserve">python </w:t>
+      </w:r>
+      <w:r>
+        <w:rPr>
+          <w:rFonts w:ascii="Cambria" w:hAnsi="Cambria" w:cs="Courier New"/>
+          <w:sz w:val="24"/>
+          <w:szCs w:val="24"/>
+        </w:rPr>
+        <w:t xml:space="preserve">script(s) </w:t>
+      </w:r>
+      <w:r>
+        <w:rPr>
+          <w:rFonts w:ascii="Cambria" w:hAnsi="Cambria" w:cs="Courier New"/>
+          <w:sz w:val="24"/>
+          <w:szCs w:val="24"/>
+        </w:rPr>
+        <w:t>included in the model folder create the .csv files and</w:t>
+      </w:r>
+      <w:r>
+        <w:rPr>
+          <w:rFonts w:ascii="Cambria" w:hAnsi="Cambria" w:cs="Courier New"/>
+          <w:sz w:val="24"/>
+          <w:szCs w:val="24"/>
+        </w:rPr>
+        <w:t xml:space="preserve"> allow the user to </w:t>
+      </w:r>
+      <w:r>
+        <w:rPr>
+          <w:rFonts w:ascii="Cambria" w:hAnsi="Cambria" w:cs="Courier New"/>
+          <w:sz w:val="24"/>
+          <w:szCs w:val="24"/>
+        </w:rPr>
+        <w:t>manipulate</w:t>
+      </w:r>
+      <w:r>
+        <w:rPr>
+          <w:rFonts w:ascii="Cambria" w:hAnsi="Cambria" w:cs="Courier New"/>
+          <w:sz w:val="24"/>
+          <w:szCs w:val="24"/>
+        </w:rPr>
+        <w:t xml:space="preserve"> their own</w:t>
+      </w:r>
+      <w:r>
+        <w:rPr>
+          <w:rFonts w:ascii="Cambria" w:hAnsi="Cambria" w:cs="Courier New"/>
+          <w:sz w:val="24"/>
+          <w:szCs w:val="24"/>
+        </w:rPr>
+        <w:t xml:space="preserve"> zoning</w:t>
+      </w:r>
+      <w:r>
+        <w:rPr>
+          <w:rFonts w:ascii="Cambria" w:hAnsi="Cambria" w:cs="Courier New"/>
+          <w:sz w:val="24"/>
+          <w:szCs w:val="24"/>
+        </w:rPr>
+        <w:t xml:space="preserve"> labels </w:t>
+      </w:r>
+      <w:r>
+        <w:rPr>
+          <w:rFonts w:ascii="Cambria" w:hAnsi="Cambria" w:cs="Courier New"/>
+          <w:sz w:val="24"/>
+          <w:szCs w:val="24"/>
+        </w:rPr>
+        <w:t>if</w:t>
+      </w:r>
+      <w:r>
+        <w:rPr>
+          <w:rFonts w:ascii="Cambria" w:hAnsi="Cambria" w:cs="Courier New"/>
+          <w:sz w:val="24"/>
+          <w:szCs w:val="24"/>
+        </w:rPr>
+        <w:t xml:space="preserve"> preferred</w:t>
+      </w:r>
+      <w:r>
+        <w:rPr>
+          <w:rFonts w:ascii="Cambria" w:hAnsi="Cambria" w:cs="Courier New"/>
+          <w:sz w:val="24"/>
+          <w:szCs w:val="24"/>
+        </w:rPr>
+        <w:t xml:space="preserve"> </w:t>
+      </w:r>
+      <w:r>
+        <w:rPr>
+          <w:rFonts w:ascii="Cambria" w:hAnsi="Cambria" w:cs="Courier New"/>
+          <w:sz w:val="24"/>
+          <w:szCs w:val="24"/>
+        </w:rPr>
+        <w:t>via</w:t>
+      </w:r>
+      <w:r>
+        <w:rPr>
+          <w:rFonts w:ascii="Cambria" w:hAnsi="Cambria" w:cs="Courier New"/>
+          <w:sz w:val="24"/>
+          <w:szCs w:val="24"/>
+        </w:rPr>
+        <w:t xml:space="preserve"> </w:t>
+      </w:r>
+      <w:proofErr w:type="gramStart"/>
+      <w:r>
+        <w:rPr>
+          <w:rFonts w:ascii="Courier New" w:hAnsi="Courier New" w:cs="Courier New"/>
+          <w:sz w:val="24"/>
+          <w:szCs w:val="24"/>
+        </w:rPr>
+        <w:t>zone_classification_IEEE</w:t>
+      </w:r>
+      <w:r>
+        <w:rPr>
+          <w:rFonts w:ascii="Courier New" w:hAnsi="Courier New" w:cs="Courier New"/>
+          <w:sz w:val="24"/>
+          <w:szCs w:val="24"/>
+        </w:rPr>
+        <w:t>123_PVxx.py</w:t>
+      </w:r>
+      <w:r>
+        <w:rPr>
+          <w:rFonts w:ascii="Cambria" w:hAnsi="Cambria" w:cs="Courier New"/>
+          <w:sz w:val="24"/>
+          <w:szCs w:val="24"/>
+        </w:rPr>
+        <w:t>, and</w:t>
+      </w:r>
+      <w:proofErr w:type="gramEnd"/>
+      <w:r>
+        <w:rPr>
+          <w:rFonts w:ascii="Cambria" w:hAnsi="Cambria" w:cs="Courier New"/>
+          <w:sz w:val="24"/>
+          <w:szCs w:val="24"/>
+        </w:rPr>
+        <w:t xml:space="preserve"> are not needed </w:t>
+      </w:r>
+      <w:r>
+        <w:rPr>
+          <w:rFonts w:ascii="Cambria" w:hAnsi="Cambria" w:cs="Courier New"/>
+          <w:sz w:val="24"/>
+          <w:szCs w:val="24"/>
+        </w:rPr>
+        <w:t>for running transient simulations</w:t>
+      </w:r>
+      <w:r>
+        <w:rPr>
+          <w:rFonts w:ascii="Cambria" w:hAnsi="Cambria" w:cs="Courier New"/>
+          <w:sz w:val="24"/>
+          <w:szCs w:val="24"/>
+        </w:rPr>
+        <w:t xml:space="preserve">. </w:t>
+      </w:r>
+      <w:r>
+        <w:rPr>
+          <w:rFonts w:ascii="Cambria" w:hAnsi="Cambria" w:cs="Courier New"/>
+          <w:sz w:val="24"/>
+          <w:szCs w:val="24"/>
+        </w:rPr>
+        <w:t xml:space="preserve"> </w:t>
+      </w:r>
+      <w:r>
+        <w:rPr>
+          <w:rFonts w:ascii="Cambria" w:hAnsi="Cambria" w:cs="Courier New"/>
+          <w:sz w:val="24"/>
+          <w:szCs w:val="24"/>
+        </w:rPr>
+        <w:t xml:space="preserve">Having access to </w:t>
+      </w:r>
+      <w:r>
+        <w:rPr>
+          <w:rFonts w:ascii="Cambria" w:hAnsi="Cambria" w:cs="Courier New"/>
+          <w:sz w:val="24"/>
+          <w:szCs w:val="24"/>
+        </w:rPr>
+        <w:t>such a collection of</w:t>
+      </w:r>
+      <w:r>
+        <w:rPr>
+          <w:rFonts w:ascii="Cambria" w:hAnsi="Cambria" w:cs="Courier New"/>
+          <w:sz w:val="24"/>
+          <w:szCs w:val="24"/>
+        </w:rPr>
+        <w:t xml:space="preserve"> </w:t>
+      </w:r>
+      <w:r>
+        <w:rPr>
+          <w:rFonts w:ascii="Cambria" w:hAnsi="Cambria" w:cs="Courier New"/>
+          <w:sz w:val="24"/>
+          <w:szCs w:val="24"/>
+        </w:rPr>
+        <w:t>files in one package</w:t>
+      </w:r>
+      <w:r>
+        <w:rPr>
+          <w:rFonts w:ascii="Cambria" w:hAnsi="Cambria" w:cs="Courier New"/>
+          <w:sz w:val="24"/>
+          <w:szCs w:val="24"/>
+        </w:rPr>
+        <w:t xml:space="preserve"> allows the user to customize their code to</w:t>
+      </w:r>
+      <w:r>
+        <w:rPr>
+          <w:rFonts w:ascii="Cambria" w:hAnsi="Cambria" w:cs="Courier New"/>
+          <w:sz w:val="24"/>
+          <w:szCs w:val="24"/>
+        </w:rPr>
+        <w:t xml:space="preserve"> simulate</w:t>
+      </w:r>
+      <w:r>
+        <w:rPr>
+          <w:rFonts w:ascii="Cambria" w:hAnsi="Cambria" w:cs="Courier New"/>
+          <w:sz w:val="24"/>
+          <w:szCs w:val="24"/>
+        </w:rPr>
+        <w:t xml:space="preserve"> various fault types in different locations across the </w:t>
+      </w:r>
+      <w:r>
+        <w:rPr>
+          <w:rFonts w:ascii="Cambria" w:hAnsi="Cambria" w:cs="Courier New"/>
+          <w:sz w:val="24"/>
+          <w:szCs w:val="24"/>
+        </w:rPr>
+        <w:t xml:space="preserve">distribution </w:t>
+      </w:r>
+      <w:r>
+        <w:rPr>
+          <w:rFonts w:ascii="Cambria" w:hAnsi="Cambria" w:cs="Courier New"/>
+          <w:sz w:val="24"/>
+          <w:szCs w:val="24"/>
+        </w:rPr>
+        <w:t>network</w:t>
+      </w:r>
+      <w:r>
+        <w:rPr>
+          <w:rFonts w:ascii="Cambria" w:hAnsi="Cambria" w:cs="Courier New"/>
+          <w:sz w:val="24"/>
+          <w:szCs w:val="24"/>
+        </w:rPr>
+        <w:t xml:space="preserve">, while </w:t>
+      </w:r>
+      <w:r>
+        <w:rPr>
+          <w:rFonts w:ascii="Cambria" w:hAnsi="Cambria" w:cs="Courier New"/>
+          <w:sz w:val="24"/>
+          <w:szCs w:val="24"/>
+        </w:rPr>
+        <w:t>logging</w:t>
+      </w:r>
+      <w:r>
+        <w:rPr>
+          <w:rFonts w:ascii="Cambria" w:hAnsi="Cambria" w:cs="Courier New"/>
+          <w:sz w:val="24"/>
+          <w:szCs w:val="24"/>
+        </w:rPr>
+        <w:t xml:space="preserve"> transient </w:t>
+      </w:r>
+      <w:r>
+        <w:rPr>
+          <w:rFonts w:ascii="Cambria" w:hAnsi="Cambria" w:cs="Courier New"/>
+          <w:sz w:val="24"/>
+          <w:szCs w:val="24"/>
+        </w:rPr>
+        <w:t>outputs</w:t>
+      </w:r>
+      <w:r>
+        <w:rPr>
+          <w:rFonts w:ascii="Cambria" w:hAnsi="Cambria" w:cs="Courier New"/>
+          <w:sz w:val="24"/>
+          <w:szCs w:val="24"/>
+        </w:rPr>
+        <w:t xml:space="preserve">. </w:t>
+      </w:r>
+    </w:p>
+    <w:p>
+      <w:pPr>
+        <w:spacing w:line="240" w:lineRule="auto"/>
+        <w:rPr>
+          <w:rFonts w:ascii="Cambria" w:hAnsi="Cambria" w:cs="Courier New"/>
+          <w:sz w:val="24"/>
+          <w:szCs w:val="24"/>
+        </w:rPr>
+      </w:pPr>
+      <w:r>
+        <w:rPr>
+          <w:rFonts w:ascii="Cambria" w:hAnsi="Cambria" w:cs="Courier New"/>
+          <w:sz w:val="24"/>
+          <w:szCs w:val="24"/>
+        </w:rPr>
         <w:t>Finally</w:t>
       </w:r>
       <w:r>
@@ -4692,16 +5017,7 @@
           <w:sz w:val="24"/>
           <w:szCs w:val="24"/>
         </w:rPr>
-        <w:t xml:space="preserve">of the randomly selected </w:t>
-      </w:r>
-      <w:r>
-        <w:rPr>
-          <w:rFonts w:ascii="Cambria" w:hAnsi="Cambria" w:cs="Courier New"/>
-          <w:sz w:val="24"/>
-          <w:szCs w:val="24"/>
-        </w:rPr>
-        <w:lastRenderedPageBreak/>
-        <w:t xml:space="preserve">bus </w:t>
+        <w:t xml:space="preserve">of the randomly selected bus </w:t>
       </w:r>
       <w:r>
         <w:rPr>
@@ -5290,14 +5606,27 @@
       <w:r>
         <w:t xml:space="preserve">Table </w:t>
       </w:r>
-      <w:fldSimple w:instr=" SEQ Table \* ARABIC ">
-        <w:r>
-          <w:rPr>
-            <w:noProof/>
-          </w:rPr>
-          <w:t>2</w:t>
-        </w:r>
-      </w:fldSimple>
+      <w:r>
+        <w:fldChar w:fldCharType="begin"/>
+      </w:r>
+      <w:r>
+        <w:instrText xml:space="preserve"> SEQ Table \* ARABIC </w:instrText>
+      </w:r>
+      <w:r>
+        <w:fldChar w:fldCharType="separate"/>
+      </w:r>
+      <w:r>
+        <w:rPr>
+          <w:noProof/>
+        </w:rPr>
+        <w:t>2</w:t>
+      </w:r>
+      <w:r>
+        <w:rPr>
+          <w:noProof/>
+        </w:rPr>
+        <w:fldChar w:fldCharType="end"/>
+      </w:r>
       <w:r>
         <w:t xml:space="preserve"> Single Line-to-Ground Fault Phase A</w:t>
       </w:r>
@@ -5310,6 +5639,7 @@
         <w:rPr>
           <w:noProof/>
         </w:rPr>
+        <w:lastRenderedPageBreak/>
         <w:drawing>
           <wp:inline distT="0" distB="0" distL="0" distR="0" wp14:anchorId="4D627ED3" wp14:editId="1EA37B4B">
             <wp:extent cx="5943600" cy="1273810"/>
@@ -5360,14 +5690,27 @@
       <w:r>
         <w:t xml:space="preserve">Table </w:t>
       </w:r>
-      <w:fldSimple w:instr=" SEQ Table \* ARABIC ">
-        <w:r>
-          <w:rPr>
-            <w:noProof/>
-          </w:rPr>
-          <w:t>3</w:t>
-        </w:r>
-      </w:fldSimple>
+      <w:r>
+        <w:fldChar w:fldCharType="begin"/>
+      </w:r>
+      <w:r>
+        <w:instrText xml:space="preserve"> SEQ Table \* ARABIC </w:instrText>
+      </w:r>
+      <w:r>
+        <w:fldChar w:fldCharType="separate"/>
+      </w:r>
+      <w:r>
+        <w:rPr>
+          <w:noProof/>
+        </w:rPr>
+        <w:t>3</w:t>
+      </w:r>
+      <w:r>
+        <w:rPr>
+          <w:noProof/>
+        </w:rPr>
+        <w:fldChar w:fldCharType="end"/>
+      </w:r>
       <w:r>
         <w:t xml:space="preserve"> Double Line-to-Ground Fault Phases </w:t>
       </w:r>
@@ -5435,14 +5778,27 @@
       <w:r>
         <w:t xml:space="preserve">Table </w:t>
       </w:r>
-      <w:fldSimple w:instr=" SEQ Table \* ARABIC ">
-        <w:r>
-          <w:rPr>
-            <w:noProof/>
-          </w:rPr>
-          <w:t>4</w:t>
-        </w:r>
-      </w:fldSimple>
+      <w:r>
+        <w:fldChar w:fldCharType="begin"/>
+      </w:r>
+      <w:r>
+        <w:instrText xml:space="preserve"> SEQ Table \* ARABIC </w:instrText>
+      </w:r>
+      <w:r>
+        <w:fldChar w:fldCharType="separate"/>
+      </w:r>
+      <w:r>
+        <w:rPr>
+          <w:noProof/>
+        </w:rPr>
+        <w:t>4</w:t>
+      </w:r>
+      <w:r>
+        <w:rPr>
+          <w:noProof/>
+        </w:rPr>
+        <w:fldChar w:fldCharType="end"/>
+      </w:r>
       <w:r>
         <w:t xml:space="preserve"> Three phase Line-to-Ground Fault</w:t>
       </w:r>
@@ -5460,6 +5816,119 @@
 <file path=word/numbering.xml><?xml version="1.0" encoding="utf-8"?>
 <w:numbering xmlns:wpc="http://schemas.microsoft.com/office/word/2010/wordprocessingCanvas" xmlns:cx="http://schemas.microsoft.com/office/drawing/2014/chartex" xmlns:cx1="http://schemas.microsoft.com/office/drawing/2015/9/8/chartex" xmlns:cx2="http://schemas.microsoft.com/office/drawing/2015/10/21/chartex" xmlns:cx3="http://schemas.microsoft.com/office/drawing/2016/5/9/chartex" xmlns:cx4="http://schemas.microsoft.com/office/drawing/2016/5/10/chartex" xmlns:cx5="http://schemas.microsoft.com/office/drawing/2016/5/11/chartex" xmlns:cx6="http://schemas.microsoft.com/office/drawing/2016/5/12/chartex" xmlns:cx7="http://schemas.microsoft.com/office/drawing/2016/5/13/chartex" xmlns:cx8="http://schemas.microsoft.com/office/drawing/2016/5/14/chartex" xmlns:mc="http://schemas.openxmlformats.org/markup-compatibility/2006" xmlns:aink="http://schemas.microsoft.com/office/drawing/2016/ink" xmlns:am3d="http://schemas.microsoft.com/office/drawing/2017/model3d" xmlns:o="urn:schemas-microsoft-com:office:office" xmlns:oel="http://schemas.microsoft.com/office/2019/extlst" xmlns:r="http://schemas.openxmlformats.org/officeDocument/2006/relationships" xmlns:m="http://schemas.openxmlformats.org/officeDocument/2006/math" xmlns:v="urn:schemas-microsoft-com:vml" xmlns:wp14="http://schemas.microsoft.com/office/word/2010/wordprocessingDrawing" xmlns:wp="http://schemas.openxmlformats.org/drawingml/2006/wordprocessingDrawing" xmlns:w10="urn:schemas-microsoft-com:office:word" xmlns:w="http://schemas.openxmlformats.org/wordprocessingml/2006/main" xmlns:w14="http://schemas.microsoft.com/office/word/2010/wordml" xmlns:w15="http://schemas.microsoft.com/office/word/2012/wordml" xmlns:w16cex="http://schemas.microsoft.com/office/word/2018/wordml/cex" xmlns:w16cid="http://schemas.microsoft.com/office/word/2016/wordml/cid" xmlns:w16="http://schemas.microsoft.com/office/word/2018/wordml" xmlns:w16sdtdh="http://schemas.microsoft.com/office/word/2020/wordml/sdtdatahash" xmlns:w16se="http://schemas.microsoft.com/office/word/2015/wordml/symex" xmlns:wpg="http://schemas.microsoft.com/office/word/2010/wordprocessingGroup" xmlns:wpi="http://schemas.microsoft.com/office/word/2010/wordprocessingInk" xmlns:wne="http://schemas.microsoft.com/office/word/2006/wordml" xmlns:wps="http://schemas.microsoft.com/office/word/2010/wordprocessingShape" mc:Ignorable="w14 w15 w16se w16cid w16 w16cex w16sdtdh wp14">
   <w:abstractNum w:abstractNumId="0" w15:restartNumberingAfterBreak="0">
+    <w:nsid w:val="46490F0A"/>
+    <w:multiLevelType w:val="hybridMultilevel"/>
+    <w:tmpl w:val="5C5A7B4A"/>
+    <w:lvl w:ilvl="0" w:tplc="04090001">
+      <w:start w:val="1"/>
+      <w:numFmt w:val="bullet"/>
+      <w:lvlText w:val=""/>
+      <w:lvlJc w:val="left"/>
+      <w:pPr>
+        <w:ind w:left="720" w:hanging="360"/>
+      </w:pPr>
+      <w:rPr>
+        <w:rFonts w:ascii="Symbol" w:hAnsi="Symbol" w:hint="default"/>
+      </w:rPr>
+    </w:lvl>
+    <w:lvl w:ilvl="1" w:tplc="04090003">
+      <w:start w:val="1"/>
+      <w:numFmt w:val="bullet"/>
+      <w:lvlText w:val="o"/>
+      <w:lvlJc w:val="left"/>
+      <w:pPr>
+        <w:ind w:left="1440" w:hanging="360"/>
+      </w:pPr>
+      <w:rPr>
+        <w:rFonts w:ascii="Courier New" w:hAnsi="Courier New" w:cs="Courier New" w:hint="default"/>
+      </w:rPr>
+    </w:lvl>
+    <w:lvl w:ilvl="2" w:tplc="04090005" w:tentative="1">
+      <w:start w:val="1"/>
+      <w:numFmt w:val="bullet"/>
+      <w:lvlText w:val=""/>
+      <w:lvlJc w:val="left"/>
+      <w:pPr>
+        <w:ind w:left="2160" w:hanging="360"/>
+      </w:pPr>
+      <w:rPr>
+        <w:rFonts w:ascii="Wingdings" w:hAnsi="Wingdings" w:hint="default"/>
+      </w:rPr>
+    </w:lvl>
+    <w:lvl w:ilvl="3" w:tplc="04090001" w:tentative="1">
+      <w:start w:val="1"/>
+      <w:numFmt w:val="bullet"/>
+      <w:lvlText w:val=""/>
+      <w:lvlJc w:val="left"/>
+      <w:pPr>
+        <w:ind w:left="2880" w:hanging="360"/>
+      </w:pPr>
+      <w:rPr>
+        <w:rFonts w:ascii="Symbol" w:hAnsi="Symbol" w:hint="default"/>
+      </w:rPr>
+    </w:lvl>
+    <w:lvl w:ilvl="4" w:tplc="04090003" w:tentative="1">
+      <w:start w:val="1"/>
+      <w:numFmt w:val="bullet"/>
+      <w:lvlText w:val="o"/>
+      <w:lvlJc w:val="left"/>
+      <w:pPr>
+        <w:ind w:left="3600" w:hanging="360"/>
+      </w:pPr>
+      <w:rPr>
+        <w:rFonts w:ascii="Courier New" w:hAnsi="Courier New" w:cs="Courier New" w:hint="default"/>
+      </w:rPr>
+    </w:lvl>
+    <w:lvl w:ilvl="5" w:tplc="04090005" w:tentative="1">
+      <w:start w:val="1"/>
+      <w:numFmt w:val="bullet"/>
+      <w:lvlText w:val=""/>
+      <w:lvlJc w:val="left"/>
+      <w:pPr>
+        <w:ind w:left="4320" w:hanging="360"/>
+      </w:pPr>
+      <w:rPr>
+        <w:rFonts w:ascii="Wingdings" w:hAnsi="Wingdings" w:hint="default"/>
+      </w:rPr>
+    </w:lvl>
+    <w:lvl w:ilvl="6" w:tplc="04090001" w:tentative="1">
+      <w:start w:val="1"/>
+      <w:numFmt w:val="bullet"/>
+      <w:lvlText w:val=""/>
+      <w:lvlJc w:val="left"/>
+      <w:pPr>
+        <w:ind w:left="5040" w:hanging="360"/>
+      </w:pPr>
+      <w:rPr>
+        <w:rFonts w:ascii="Symbol" w:hAnsi="Symbol" w:hint="default"/>
+      </w:rPr>
+    </w:lvl>
+    <w:lvl w:ilvl="7" w:tplc="04090003" w:tentative="1">
+      <w:start w:val="1"/>
+      <w:numFmt w:val="bullet"/>
+      <w:lvlText w:val="o"/>
+      <w:lvlJc w:val="left"/>
+      <w:pPr>
+        <w:ind w:left="5760" w:hanging="360"/>
+      </w:pPr>
+      <w:rPr>
+        <w:rFonts w:ascii="Courier New" w:hAnsi="Courier New" w:cs="Courier New" w:hint="default"/>
+      </w:rPr>
+    </w:lvl>
+    <w:lvl w:ilvl="8" w:tplc="04090005" w:tentative="1">
+      <w:start w:val="1"/>
+      <w:numFmt w:val="bullet"/>
+      <w:lvlText w:val=""/>
+      <w:lvlJc w:val="left"/>
+      <w:pPr>
+        <w:ind w:left="6480" w:hanging="360"/>
+      </w:pPr>
+      <w:rPr>
+        <w:rFonts w:ascii="Wingdings" w:hAnsi="Wingdings" w:hint="default"/>
+      </w:rPr>
+    </w:lvl>
+  </w:abstractNum>
+  <w:abstractNum w:abstractNumId="1" w15:restartNumberingAfterBreak="0">
     <w:nsid w:val="55950BBD"/>
     <w:multiLevelType w:val="hybridMultilevel"/>
     <w:tmpl w:val="1F489318"/>
@@ -5572,7 +6041,7 @@
       </w:rPr>
     </w:lvl>
   </w:abstractNum>
-  <w:abstractNum w:abstractNumId="1" w15:restartNumberingAfterBreak="0">
+  <w:abstractNum w:abstractNumId="2" w15:restartNumberingAfterBreak="0">
     <w:nsid w:val="793D6638"/>
     <w:multiLevelType w:val="hybridMultilevel"/>
     <w:tmpl w:val="84B6BFDE"/>
@@ -5659,9 +6128,12 @@
     </w:lvl>
   </w:abstractNum>
   <w:num w:numId="1" w16cid:durableId="1484741210">
+    <w:abstractNumId w:val="2"/>
+  </w:num>
+  <w:num w:numId="2" w16cid:durableId="1162545824">
     <w:abstractNumId w:val="1"/>
   </w:num>
-  <w:num w:numId="2" w16cid:durableId="1162545824">
+  <w:num w:numId="3" w16cid:durableId="2063866602">
     <w:abstractNumId w:val="0"/>
   </w:num>
 </w:numbering>

</xml_diff>